<commit_message>
feat(workspace): enhance A4 rendering, Word-like editing, and outline navigation
</commit_message>
<xml_diff>
--- a/examples/demo_report.docx
+++ b/examples/demo_report.docx
@@ -2,25 +2,6 @@
 <file path=word/document.xml><?xml version="1.0" encoding="utf-8"?>
 <w:document xmlns:wpc="http://schemas.microsoft.com/office/word/2010/wordprocessingCanvas" xmlns:mo="http://schemas.microsoft.com/office/mac/office/2008/main" xmlns:mc="http://schemas.openxmlformats.org/markup-compatibility/2006" xmlns:mv="urn:schemas-microsoft-com:mac:vml" xmlns:o="urn:schemas-microsoft-com:office:office" xmlns:r="http://schemas.openxmlformats.org/officeDocument/2006/relationships" xmlns:m="http://schemas.openxmlformats.org/officeDocument/2006/math" xmlns:v="urn:schemas-microsoft-com:vml" xmlns:wp14="http://schemas.microsoft.com/office/word/2010/wordprocessingDrawing" xmlns:wp="http://schemas.openxmlformats.org/drawingml/2006/wordprocessingDrawing" xmlns:w10="urn:schemas-microsoft-com:office:word" xmlns:w="http://schemas.openxmlformats.org/wordprocessingml/2006/main" xmlns:w14="http://schemas.microsoft.com/office/word/2010/wordml" xmlns:wpg="http://schemas.microsoft.com/office/word/2010/wordprocessingGroup" xmlns:wpi="http://schemas.microsoft.com/office/word/2010/wordprocessingInk" xmlns:wne="http://schemas.microsoft.com/office/word/2006/wordml" xmlns:wps="http://schemas.microsoft.com/office/word/2010/wordprocessingShape" mc:Ignorable="w14 wp14">
   <w:body>
-    <w:p>
-      <w:pPr>
-        <w:pStyle w:val="Heading1"/>
-      </w:pPr>
-      <w:r>
-        <w:t>MỤC LỤC BÁO CÁO</w:t>
-      </w:r>
-    </w:p>
-    <w:p>
-      <w:pPr>
-        <w:pStyle w:val="TOCHeading"/>
-      </w:pPr>
-      <w:fldSimple w:instr="TOC \o &quot;1-3&quot; \h \z \u">
-        <w:r>
-          <w:rPr/>
-          <w:t>Table of Contents (Press F9 or right-click to update in Word)</w:t>
-        </w:r>
-      </w:fldSimple>
-    </w:p>
     <w:p>
       <w:pPr>
         <w:pStyle w:val="Title"/>
@@ -241,7 +222,7 @@
       <w:r>
         <w:drawing>
           <wp:inline xmlns:a="http://schemas.openxmlformats.org/drawingml/2006/main" xmlns:pic="http://schemas.openxmlformats.org/drawingml/2006/picture">
-            <wp:extent cx="3600000" cy="1800000"/>
+            <wp:extent cx="4680000" cy="2340000"/>
             <wp:docPr id="1" name="Picture 1"/>
             <wp:cNvGraphicFramePr>
               <a:graphicFrameLocks noChangeAspect="1"/>
@@ -262,7 +243,7 @@
                   <pic:spPr>
                     <a:xfrm>
                       <a:off x="0" y="0"/>
-                      <a:ext cx="3600000" cy="1800000"/>
+                      <a:ext cx="4680000" cy="2340000"/>
                     </a:xfrm>
                     <a:prstGeom prst="rect"/>
                   </pic:spPr>

</xml_diff>